<commit_message>
Add cassowary + wild pig (12 species); add "other tool → specify"
- Species list now 12 (added Cassowary and Wild pig) — affordable because the
  follow-up grids (C/E/G) are gated to hunted species.
- New Module C free-text field c_method_other_specify captures what "Other"
  (tool 18) was, closing the tick-only grid gap.
- Export now 645 columns; headless export test and Playwright E2E pass.
- Regenerated paper questionnaire + interviewer guide; updated README /
  supervisor guide column counts; app_version -> 2.1.0.

Co-Authored-By: Claude Opus 4.8 <noreply@anthropic.com>
Claude-Session: https://claude.ai/code/session_01WBADq1mAGXBC8npA3LtAz1
</commit_message>
<xml_diff>
--- a/docs/MCA_Hunt_Paper_Questionnaire.docx
+++ b/docs/MCA_Hunt_Paper_Questionnaire.docx
@@ -2553,6 +2553,306 @@
                 <w:bCs/>
               </w:rPr>
               <w:t xml:space="preserve">Bushfowl</w:t>
+            </w:r>
+          </w:p>
+        </w:tc>
+        <w:tc>
+          <w:tcPr>
+            <w:tcW w:type="dxa" w:w="2600"/>
+            <w:tcMar>
+              <w:top w:type="dxa" w:w="40"/>
+              <w:left w:type="dxa" w:w="60"/>
+              <w:bottom w:type="dxa" w:w="40"/>
+              <w:right w:type="dxa" w:w="60"/>
+            </w:tcMar>
+            <w:vAlign w:val="center"/>
+          </w:tcPr>
+          <w:p>
+            <w:pPr>
+              <w:spacing w:after="60"/>
+            </w:pPr>
+            <w:r>
+              <w:rPr>
+                <w:sz w:val="18"/>
+                <w:szCs w:val="18"/>
+              </w:rPr>
+              <w:t xml:space="preserve">☐ Y  ☐ K  ☐ N  ☐ O</w:t>
+            </w:r>
+          </w:p>
+        </w:tc>
+        <w:tc>
+          <w:tcPr>
+            <w:tcW w:type="dxa" w:w="1300"/>
+            <w:tcMar>
+              <w:top w:type="dxa" w:w="40"/>
+              <w:left w:type="dxa" w:w="60"/>
+              <w:bottom w:type="dxa" w:w="40"/>
+              <w:right w:type="dxa" w:w="60"/>
+            </w:tcMar>
+            <w:vAlign w:val="center"/>
+          </w:tcPr>
+          <w:p>
+            <w:pPr>
+              <w:spacing w:after="60"/>
+            </w:pPr>
+            <w:r>
+              <w:t xml:space="preserve">☐</w:t>
+            </w:r>
+          </w:p>
+        </w:tc>
+        <w:tc>
+          <w:tcPr>
+            <w:tcW w:type="dxa" w:w="1300"/>
+            <w:tcMar>
+              <w:top w:type="dxa" w:w="40"/>
+              <w:left w:type="dxa" w:w="60"/>
+              <w:bottom w:type="dxa" w:w="40"/>
+              <w:right w:type="dxa" w:w="60"/>
+            </w:tcMar>
+            <w:vAlign w:val="center"/>
+          </w:tcPr>
+          <w:p>
+            <w:pPr>
+              <w:spacing w:after="60"/>
+            </w:pPr>
+            <w:r>
+              <w:t xml:space="preserve">☐</w:t>
+            </w:r>
+          </w:p>
+        </w:tc>
+        <w:tc>
+          <w:tcPr>
+            <w:tcW w:type="dxa" w:w="1300"/>
+            <w:tcMar>
+              <w:top w:type="dxa" w:w="40"/>
+              <w:left w:type="dxa" w:w="60"/>
+              <w:bottom w:type="dxa" w:w="40"/>
+              <w:right w:type="dxa" w:w="60"/>
+            </w:tcMar>
+            <w:vAlign w:val="center"/>
+          </w:tcPr>
+          <w:p>
+            <w:pPr>
+              <w:spacing w:after="60"/>
+            </w:pPr>
+            <w:r>
+              <w:t xml:space="preserve">☐</w:t>
+            </w:r>
+          </w:p>
+        </w:tc>
+        <w:tc>
+          <w:tcPr>
+            <w:tcW w:type="dxa" w:w="1300"/>
+            <w:tcMar>
+              <w:top w:type="dxa" w:w="40"/>
+              <w:left w:type="dxa" w:w="60"/>
+              <w:bottom w:type="dxa" w:w="40"/>
+              <w:right w:type="dxa" w:w="60"/>
+            </w:tcMar>
+            <w:vAlign w:val="center"/>
+          </w:tcPr>
+          <w:p>
+            <w:pPr>
+              <w:spacing w:after="60"/>
+            </w:pPr>
+            <w:r>
+              <w:t xml:space="preserve">☐</w:t>
+            </w:r>
+          </w:p>
+        </w:tc>
+        <w:tc>
+          <w:tcPr>
+            <w:tcW w:type="dxa" w:w="5898"/>
+            <w:tcMar>
+              <w:top w:type="dxa" w:w="40"/>
+              <w:left w:type="dxa" w:w="60"/>
+              <w:bottom w:type="dxa" w:w="40"/>
+              <w:right w:type="dxa" w:w="60"/>
+            </w:tcMar>
+            <w:vAlign w:val="center"/>
+          </w:tcPr>
+          <w:p>
+            <w:pPr>
+              <w:spacing w:after="60"/>
+            </w:pPr>
+            <w:r>
+              <w:t xml:space="preserve"/>
+            </w:r>
+          </w:p>
+        </w:tc>
+      </w:tr>
+      <w:tr>
+        <w:tc>
+          <w:tcPr>
+            <w:tcW w:type="dxa" w:w="1700"/>
+            <w:tcMar>
+              <w:top w:type="dxa" w:w="40"/>
+              <w:left w:type="dxa" w:w="60"/>
+              <w:bottom w:type="dxa" w:w="40"/>
+              <w:right w:type="dxa" w:w="60"/>
+            </w:tcMar>
+            <w:vAlign w:val="center"/>
+          </w:tcPr>
+          <w:p>
+            <w:pPr>
+              <w:spacing w:after="60"/>
+            </w:pPr>
+            <w:r>
+              <w:rPr>
+                <w:b/>
+                <w:bCs/>
+              </w:rPr>
+              <w:t xml:space="preserve">Cassowary</w:t>
+            </w:r>
+          </w:p>
+        </w:tc>
+        <w:tc>
+          <w:tcPr>
+            <w:tcW w:type="dxa" w:w="2600"/>
+            <w:tcMar>
+              <w:top w:type="dxa" w:w="40"/>
+              <w:left w:type="dxa" w:w="60"/>
+              <w:bottom w:type="dxa" w:w="40"/>
+              <w:right w:type="dxa" w:w="60"/>
+            </w:tcMar>
+            <w:vAlign w:val="center"/>
+          </w:tcPr>
+          <w:p>
+            <w:pPr>
+              <w:spacing w:after="60"/>
+            </w:pPr>
+            <w:r>
+              <w:rPr>
+                <w:sz w:val="18"/>
+                <w:szCs w:val="18"/>
+              </w:rPr>
+              <w:t xml:space="preserve">☐ Y  ☐ K  ☐ N  ☐ O</w:t>
+            </w:r>
+          </w:p>
+        </w:tc>
+        <w:tc>
+          <w:tcPr>
+            <w:tcW w:type="dxa" w:w="1300"/>
+            <w:tcMar>
+              <w:top w:type="dxa" w:w="40"/>
+              <w:left w:type="dxa" w:w="60"/>
+              <w:bottom w:type="dxa" w:w="40"/>
+              <w:right w:type="dxa" w:w="60"/>
+            </w:tcMar>
+            <w:vAlign w:val="center"/>
+          </w:tcPr>
+          <w:p>
+            <w:pPr>
+              <w:spacing w:after="60"/>
+            </w:pPr>
+            <w:r>
+              <w:t xml:space="preserve">☐</w:t>
+            </w:r>
+          </w:p>
+        </w:tc>
+        <w:tc>
+          <w:tcPr>
+            <w:tcW w:type="dxa" w:w="1300"/>
+            <w:tcMar>
+              <w:top w:type="dxa" w:w="40"/>
+              <w:left w:type="dxa" w:w="60"/>
+              <w:bottom w:type="dxa" w:w="40"/>
+              <w:right w:type="dxa" w:w="60"/>
+            </w:tcMar>
+            <w:vAlign w:val="center"/>
+          </w:tcPr>
+          <w:p>
+            <w:pPr>
+              <w:spacing w:after="60"/>
+            </w:pPr>
+            <w:r>
+              <w:t xml:space="preserve">☐</w:t>
+            </w:r>
+          </w:p>
+        </w:tc>
+        <w:tc>
+          <w:tcPr>
+            <w:tcW w:type="dxa" w:w="1300"/>
+            <w:tcMar>
+              <w:top w:type="dxa" w:w="40"/>
+              <w:left w:type="dxa" w:w="60"/>
+              <w:bottom w:type="dxa" w:w="40"/>
+              <w:right w:type="dxa" w:w="60"/>
+            </w:tcMar>
+            <w:vAlign w:val="center"/>
+          </w:tcPr>
+          <w:p>
+            <w:pPr>
+              <w:spacing w:after="60"/>
+            </w:pPr>
+            <w:r>
+              <w:t xml:space="preserve">☐</w:t>
+            </w:r>
+          </w:p>
+        </w:tc>
+        <w:tc>
+          <w:tcPr>
+            <w:tcW w:type="dxa" w:w="1300"/>
+            <w:tcMar>
+              <w:top w:type="dxa" w:w="40"/>
+              <w:left w:type="dxa" w:w="60"/>
+              <w:bottom w:type="dxa" w:w="40"/>
+              <w:right w:type="dxa" w:w="60"/>
+            </w:tcMar>
+            <w:vAlign w:val="center"/>
+          </w:tcPr>
+          <w:p>
+            <w:pPr>
+              <w:spacing w:after="60"/>
+            </w:pPr>
+            <w:r>
+              <w:t xml:space="preserve">☐</w:t>
+            </w:r>
+          </w:p>
+        </w:tc>
+        <w:tc>
+          <w:tcPr>
+            <w:tcW w:type="dxa" w:w="5898"/>
+            <w:tcMar>
+              <w:top w:type="dxa" w:w="40"/>
+              <w:left w:type="dxa" w:w="60"/>
+              <w:bottom w:type="dxa" w:w="40"/>
+              <w:right w:type="dxa" w:w="60"/>
+            </w:tcMar>
+            <w:vAlign w:val="center"/>
+          </w:tcPr>
+          <w:p>
+            <w:pPr>
+              <w:spacing w:after="60"/>
+            </w:pPr>
+            <w:r>
+              <w:t xml:space="preserve"/>
+            </w:r>
+          </w:p>
+        </w:tc>
+      </w:tr>
+      <w:tr>
+        <w:tc>
+          <w:tcPr>
+            <w:tcW w:type="dxa" w:w="1700"/>
+            <w:tcMar>
+              <w:top w:type="dxa" w:w="40"/>
+              <w:left w:type="dxa" w:w="60"/>
+              <w:bottom w:type="dxa" w:w="40"/>
+              <w:right w:type="dxa" w:w="60"/>
+            </w:tcMar>
+            <w:vAlign w:val="center"/>
+          </w:tcPr>
+          <w:p>
+            <w:pPr>
+              <w:spacing w:after="60"/>
+            </w:pPr>
+            <w:r>
+              <w:rPr>
+                <w:b/>
+                <w:bCs/>
+              </w:rPr>
+              <w:t xml:space="preserve">Wild pig</w:t>
             </w:r>
           </w:p>
         </w:tc>
@@ -7159,7 +7459,796 @@
           </w:p>
         </w:tc>
       </w:tr>
+      <w:tr>
+        <w:tc>
+          <w:tcPr>
+            <w:tcW w:type="dxa" w:w="1700"/>
+            <w:tcMar>
+              <w:top w:type="dxa" w:w="40"/>
+              <w:left w:type="dxa" w:w="60"/>
+              <w:bottom w:type="dxa" w:w="40"/>
+              <w:right w:type="dxa" w:w="60"/>
+            </w:tcMar>
+            <w:vAlign w:val="center"/>
+          </w:tcPr>
+          <w:p>
+            <w:pPr>
+              <w:spacing w:after="60"/>
+            </w:pPr>
+            <w:r>
+              <w:rPr>
+                <w:b/>
+                <w:bCs/>
+              </w:rPr>
+              <w:t xml:space="preserve">Cassowary</w:t>
+            </w:r>
+          </w:p>
+        </w:tc>
+        <w:tc>
+          <w:tcPr>
+            <w:tcW w:type="dxa" w:w="761"/>
+            <w:tcMar>
+              <w:top w:type="dxa" w:w="40"/>
+              <w:left w:type="dxa" w:w="60"/>
+              <w:bottom w:type="dxa" w:w="40"/>
+              <w:right w:type="dxa" w:w="60"/>
+            </w:tcMar>
+            <w:vAlign w:val="center"/>
+          </w:tcPr>
+          <w:p>
+            <w:pPr>
+              <w:spacing w:after="60"/>
+            </w:pPr>
+            <w:r>
+              <w:t xml:space="preserve">☐</w:t>
+            </w:r>
+          </w:p>
+        </w:tc>
+        <w:tc>
+          <w:tcPr>
+            <w:tcW w:type="dxa" w:w="761"/>
+            <w:tcMar>
+              <w:top w:type="dxa" w:w="40"/>
+              <w:left w:type="dxa" w:w="60"/>
+              <w:bottom w:type="dxa" w:w="40"/>
+              <w:right w:type="dxa" w:w="60"/>
+            </w:tcMar>
+            <w:vAlign w:val="center"/>
+          </w:tcPr>
+          <w:p>
+            <w:pPr>
+              <w:spacing w:after="60"/>
+            </w:pPr>
+            <w:r>
+              <w:t xml:space="preserve">☐</w:t>
+            </w:r>
+          </w:p>
+        </w:tc>
+        <w:tc>
+          <w:tcPr>
+            <w:tcW w:type="dxa" w:w="761"/>
+            <w:tcMar>
+              <w:top w:type="dxa" w:w="40"/>
+              <w:left w:type="dxa" w:w="60"/>
+              <w:bottom w:type="dxa" w:w="40"/>
+              <w:right w:type="dxa" w:w="60"/>
+            </w:tcMar>
+            <w:vAlign w:val="center"/>
+          </w:tcPr>
+          <w:p>
+            <w:pPr>
+              <w:spacing w:after="60"/>
+            </w:pPr>
+            <w:r>
+              <w:t xml:space="preserve">☐</w:t>
+            </w:r>
+          </w:p>
+        </w:tc>
+        <w:tc>
+          <w:tcPr>
+            <w:tcW w:type="dxa" w:w="761"/>
+            <w:tcMar>
+              <w:top w:type="dxa" w:w="40"/>
+              <w:left w:type="dxa" w:w="60"/>
+              <w:bottom w:type="dxa" w:w="40"/>
+              <w:right w:type="dxa" w:w="60"/>
+            </w:tcMar>
+            <w:vAlign w:val="center"/>
+          </w:tcPr>
+          <w:p>
+            <w:pPr>
+              <w:spacing w:after="60"/>
+            </w:pPr>
+            <w:r>
+              <w:t xml:space="preserve">☐</w:t>
+            </w:r>
+          </w:p>
+        </w:tc>
+        <w:tc>
+          <w:tcPr>
+            <w:tcW w:type="dxa" w:w="761"/>
+            <w:tcMar>
+              <w:top w:type="dxa" w:w="40"/>
+              <w:left w:type="dxa" w:w="60"/>
+              <w:bottom w:type="dxa" w:w="40"/>
+              <w:right w:type="dxa" w:w="60"/>
+            </w:tcMar>
+            <w:vAlign w:val="center"/>
+          </w:tcPr>
+          <w:p>
+            <w:pPr>
+              <w:spacing w:after="60"/>
+            </w:pPr>
+            <w:r>
+              <w:t xml:space="preserve">☐</w:t>
+            </w:r>
+          </w:p>
+        </w:tc>
+        <w:tc>
+          <w:tcPr>
+            <w:tcW w:type="dxa" w:w="761"/>
+            <w:tcMar>
+              <w:top w:type="dxa" w:w="40"/>
+              <w:left w:type="dxa" w:w="60"/>
+              <w:bottom w:type="dxa" w:w="40"/>
+              <w:right w:type="dxa" w:w="60"/>
+            </w:tcMar>
+            <w:vAlign w:val="center"/>
+          </w:tcPr>
+          <w:p>
+            <w:pPr>
+              <w:spacing w:after="60"/>
+            </w:pPr>
+            <w:r>
+              <w:t xml:space="preserve">☐</w:t>
+            </w:r>
+          </w:p>
+        </w:tc>
+        <w:tc>
+          <w:tcPr>
+            <w:tcW w:type="dxa" w:w="761"/>
+            <w:tcMar>
+              <w:top w:type="dxa" w:w="40"/>
+              <w:left w:type="dxa" w:w="60"/>
+              <w:bottom w:type="dxa" w:w="40"/>
+              <w:right w:type="dxa" w:w="60"/>
+            </w:tcMar>
+            <w:vAlign w:val="center"/>
+          </w:tcPr>
+          <w:p>
+            <w:pPr>
+              <w:spacing w:after="60"/>
+            </w:pPr>
+            <w:r>
+              <w:t xml:space="preserve">☐</w:t>
+            </w:r>
+          </w:p>
+        </w:tc>
+        <w:tc>
+          <w:tcPr>
+            <w:tcW w:type="dxa" w:w="761"/>
+            <w:tcMar>
+              <w:top w:type="dxa" w:w="40"/>
+              <w:left w:type="dxa" w:w="60"/>
+              <w:bottom w:type="dxa" w:w="40"/>
+              <w:right w:type="dxa" w:w="60"/>
+            </w:tcMar>
+            <w:vAlign w:val="center"/>
+          </w:tcPr>
+          <w:p>
+            <w:pPr>
+              <w:spacing w:after="60"/>
+            </w:pPr>
+            <w:r>
+              <w:t xml:space="preserve">☐</w:t>
+            </w:r>
+          </w:p>
+        </w:tc>
+        <w:tc>
+          <w:tcPr>
+            <w:tcW w:type="dxa" w:w="761"/>
+            <w:tcMar>
+              <w:top w:type="dxa" w:w="40"/>
+              <w:left w:type="dxa" w:w="60"/>
+              <w:bottom w:type="dxa" w:w="40"/>
+              <w:right w:type="dxa" w:w="60"/>
+            </w:tcMar>
+            <w:vAlign w:val="center"/>
+          </w:tcPr>
+          <w:p>
+            <w:pPr>
+              <w:spacing w:after="60"/>
+            </w:pPr>
+            <w:r>
+              <w:t xml:space="preserve">☐</w:t>
+            </w:r>
+          </w:p>
+        </w:tc>
+        <w:tc>
+          <w:tcPr>
+            <w:tcW w:type="dxa" w:w="761"/>
+            <w:tcMar>
+              <w:top w:type="dxa" w:w="40"/>
+              <w:left w:type="dxa" w:w="60"/>
+              <w:bottom w:type="dxa" w:w="40"/>
+              <w:right w:type="dxa" w:w="60"/>
+            </w:tcMar>
+            <w:vAlign w:val="center"/>
+          </w:tcPr>
+          <w:p>
+            <w:pPr>
+              <w:spacing w:after="60"/>
+            </w:pPr>
+            <w:r>
+              <w:t xml:space="preserve">☐</w:t>
+            </w:r>
+          </w:p>
+        </w:tc>
+        <w:tc>
+          <w:tcPr>
+            <w:tcW w:type="dxa" w:w="761"/>
+            <w:tcMar>
+              <w:top w:type="dxa" w:w="40"/>
+              <w:left w:type="dxa" w:w="60"/>
+              <w:bottom w:type="dxa" w:w="40"/>
+              <w:right w:type="dxa" w:w="60"/>
+            </w:tcMar>
+            <w:vAlign w:val="center"/>
+          </w:tcPr>
+          <w:p>
+            <w:pPr>
+              <w:spacing w:after="60"/>
+            </w:pPr>
+            <w:r>
+              <w:t xml:space="preserve">☐</w:t>
+            </w:r>
+          </w:p>
+        </w:tc>
+        <w:tc>
+          <w:tcPr>
+            <w:tcW w:type="dxa" w:w="761"/>
+            <w:tcMar>
+              <w:top w:type="dxa" w:w="40"/>
+              <w:left w:type="dxa" w:w="60"/>
+              <w:bottom w:type="dxa" w:w="40"/>
+              <w:right w:type="dxa" w:w="60"/>
+            </w:tcMar>
+            <w:vAlign w:val="center"/>
+          </w:tcPr>
+          <w:p>
+            <w:pPr>
+              <w:spacing w:after="60"/>
+            </w:pPr>
+            <w:r>
+              <w:t xml:space="preserve">☐</w:t>
+            </w:r>
+          </w:p>
+        </w:tc>
+        <w:tc>
+          <w:tcPr>
+            <w:tcW w:type="dxa" w:w="761"/>
+            <w:tcMar>
+              <w:top w:type="dxa" w:w="40"/>
+              <w:left w:type="dxa" w:w="60"/>
+              <w:bottom w:type="dxa" w:w="40"/>
+              <w:right w:type="dxa" w:w="60"/>
+            </w:tcMar>
+            <w:vAlign w:val="center"/>
+          </w:tcPr>
+          <w:p>
+            <w:pPr>
+              <w:spacing w:after="60"/>
+            </w:pPr>
+            <w:r>
+              <w:t xml:space="preserve">☐</w:t>
+            </w:r>
+          </w:p>
+        </w:tc>
+        <w:tc>
+          <w:tcPr>
+            <w:tcW w:type="dxa" w:w="761"/>
+            <w:tcMar>
+              <w:top w:type="dxa" w:w="40"/>
+              <w:left w:type="dxa" w:w="60"/>
+              <w:bottom w:type="dxa" w:w="40"/>
+              <w:right w:type="dxa" w:w="60"/>
+            </w:tcMar>
+            <w:vAlign w:val="center"/>
+          </w:tcPr>
+          <w:p>
+            <w:pPr>
+              <w:spacing w:after="60"/>
+            </w:pPr>
+            <w:r>
+              <w:t xml:space="preserve">☐</w:t>
+            </w:r>
+          </w:p>
+        </w:tc>
+        <w:tc>
+          <w:tcPr>
+            <w:tcW w:type="dxa" w:w="761"/>
+            <w:tcMar>
+              <w:top w:type="dxa" w:w="40"/>
+              <w:left w:type="dxa" w:w="60"/>
+              <w:bottom w:type="dxa" w:w="40"/>
+              <w:right w:type="dxa" w:w="60"/>
+            </w:tcMar>
+            <w:vAlign w:val="center"/>
+          </w:tcPr>
+          <w:p>
+            <w:pPr>
+              <w:spacing w:after="60"/>
+            </w:pPr>
+            <w:r>
+              <w:t xml:space="preserve">☐</w:t>
+            </w:r>
+          </w:p>
+        </w:tc>
+        <w:tc>
+          <w:tcPr>
+            <w:tcW w:type="dxa" w:w="761"/>
+            <w:tcMar>
+              <w:top w:type="dxa" w:w="40"/>
+              <w:left w:type="dxa" w:w="60"/>
+              <w:bottom w:type="dxa" w:w="40"/>
+              <w:right w:type="dxa" w:w="60"/>
+            </w:tcMar>
+            <w:vAlign w:val="center"/>
+          </w:tcPr>
+          <w:p>
+            <w:pPr>
+              <w:spacing w:after="60"/>
+            </w:pPr>
+            <w:r>
+              <w:t xml:space="preserve">☐</w:t>
+            </w:r>
+          </w:p>
+        </w:tc>
+        <w:tc>
+          <w:tcPr>
+            <w:tcW w:type="dxa" w:w="761"/>
+            <w:tcMar>
+              <w:top w:type="dxa" w:w="40"/>
+              <w:left w:type="dxa" w:w="60"/>
+              <w:bottom w:type="dxa" w:w="40"/>
+              <w:right w:type="dxa" w:w="60"/>
+            </w:tcMar>
+            <w:vAlign w:val="center"/>
+          </w:tcPr>
+          <w:p>
+            <w:pPr>
+              <w:spacing w:after="60"/>
+            </w:pPr>
+            <w:r>
+              <w:t xml:space="preserve">☐</w:t>
+            </w:r>
+          </w:p>
+        </w:tc>
+        <w:tc>
+          <w:tcPr>
+            <w:tcW w:type="dxa" w:w="761"/>
+            <w:tcMar>
+              <w:top w:type="dxa" w:w="40"/>
+              <w:left w:type="dxa" w:w="60"/>
+              <w:bottom w:type="dxa" w:w="40"/>
+              <w:right w:type="dxa" w:w="60"/>
+            </w:tcMar>
+            <w:vAlign w:val="center"/>
+          </w:tcPr>
+          <w:p>
+            <w:pPr>
+              <w:spacing w:after="60"/>
+            </w:pPr>
+            <w:r>
+              <w:t xml:space="preserve">☐</w:t>
+            </w:r>
+          </w:p>
+        </w:tc>
+      </w:tr>
+      <w:tr>
+        <w:tc>
+          <w:tcPr>
+            <w:tcW w:type="dxa" w:w="1700"/>
+            <w:tcMar>
+              <w:top w:type="dxa" w:w="40"/>
+              <w:left w:type="dxa" w:w="60"/>
+              <w:bottom w:type="dxa" w:w="40"/>
+              <w:right w:type="dxa" w:w="60"/>
+            </w:tcMar>
+            <w:vAlign w:val="center"/>
+          </w:tcPr>
+          <w:p>
+            <w:pPr>
+              <w:spacing w:after="60"/>
+            </w:pPr>
+            <w:r>
+              <w:rPr>
+                <w:b/>
+                <w:bCs/>
+              </w:rPr>
+              <w:t xml:space="preserve">Wild pig</w:t>
+            </w:r>
+          </w:p>
+        </w:tc>
+        <w:tc>
+          <w:tcPr>
+            <w:tcW w:type="dxa" w:w="761"/>
+            <w:tcMar>
+              <w:top w:type="dxa" w:w="40"/>
+              <w:left w:type="dxa" w:w="60"/>
+              <w:bottom w:type="dxa" w:w="40"/>
+              <w:right w:type="dxa" w:w="60"/>
+            </w:tcMar>
+            <w:vAlign w:val="center"/>
+          </w:tcPr>
+          <w:p>
+            <w:pPr>
+              <w:spacing w:after="60"/>
+            </w:pPr>
+            <w:r>
+              <w:t xml:space="preserve">☐</w:t>
+            </w:r>
+          </w:p>
+        </w:tc>
+        <w:tc>
+          <w:tcPr>
+            <w:tcW w:type="dxa" w:w="761"/>
+            <w:tcMar>
+              <w:top w:type="dxa" w:w="40"/>
+              <w:left w:type="dxa" w:w="60"/>
+              <w:bottom w:type="dxa" w:w="40"/>
+              <w:right w:type="dxa" w:w="60"/>
+            </w:tcMar>
+            <w:vAlign w:val="center"/>
+          </w:tcPr>
+          <w:p>
+            <w:pPr>
+              <w:spacing w:after="60"/>
+            </w:pPr>
+            <w:r>
+              <w:t xml:space="preserve">☐</w:t>
+            </w:r>
+          </w:p>
+        </w:tc>
+        <w:tc>
+          <w:tcPr>
+            <w:tcW w:type="dxa" w:w="761"/>
+            <w:tcMar>
+              <w:top w:type="dxa" w:w="40"/>
+              <w:left w:type="dxa" w:w="60"/>
+              <w:bottom w:type="dxa" w:w="40"/>
+              <w:right w:type="dxa" w:w="60"/>
+            </w:tcMar>
+            <w:vAlign w:val="center"/>
+          </w:tcPr>
+          <w:p>
+            <w:pPr>
+              <w:spacing w:after="60"/>
+            </w:pPr>
+            <w:r>
+              <w:t xml:space="preserve">☐</w:t>
+            </w:r>
+          </w:p>
+        </w:tc>
+        <w:tc>
+          <w:tcPr>
+            <w:tcW w:type="dxa" w:w="761"/>
+            <w:tcMar>
+              <w:top w:type="dxa" w:w="40"/>
+              <w:left w:type="dxa" w:w="60"/>
+              <w:bottom w:type="dxa" w:w="40"/>
+              <w:right w:type="dxa" w:w="60"/>
+            </w:tcMar>
+            <w:vAlign w:val="center"/>
+          </w:tcPr>
+          <w:p>
+            <w:pPr>
+              <w:spacing w:after="60"/>
+            </w:pPr>
+            <w:r>
+              <w:t xml:space="preserve">☐</w:t>
+            </w:r>
+          </w:p>
+        </w:tc>
+        <w:tc>
+          <w:tcPr>
+            <w:tcW w:type="dxa" w:w="761"/>
+            <w:tcMar>
+              <w:top w:type="dxa" w:w="40"/>
+              <w:left w:type="dxa" w:w="60"/>
+              <w:bottom w:type="dxa" w:w="40"/>
+              <w:right w:type="dxa" w:w="60"/>
+            </w:tcMar>
+            <w:vAlign w:val="center"/>
+          </w:tcPr>
+          <w:p>
+            <w:pPr>
+              <w:spacing w:after="60"/>
+            </w:pPr>
+            <w:r>
+              <w:t xml:space="preserve">☐</w:t>
+            </w:r>
+          </w:p>
+        </w:tc>
+        <w:tc>
+          <w:tcPr>
+            <w:tcW w:type="dxa" w:w="761"/>
+            <w:tcMar>
+              <w:top w:type="dxa" w:w="40"/>
+              <w:left w:type="dxa" w:w="60"/>
+              <w:bottom w:type="dxa" w:w="40"/>
+              <w:right w:type="dxa" w:w="60"/>
+            </w:tcMar>
+            <w:vAlign w:val="center"/>
+          </w:tcPr>
+          <w:p>
+            <w:pPr>
+              <w:spacing w:after="60"/>
+            </w:pPr>
+            <w:r>
+              <w:t xml:space="preserve">☐</w:t>
+            </w:r>
+          </w:p>
+        </w:tc>
+        <w:tc>
+          <w:tcPr>
+            <w:tcW w:type="dxa" w:w="761"/>
+            <w:tcMar>
+              <w:top w:type="dxa" w:w="40"/>
+              <w:left w:type="dxa" w:w="60"/>
+              <w:bottom w:type="dxa" w:w="40"/>
+              <w:right w:type="dxa" w:w="60"/>
+            </w:tcMar>
+            <w:vAlign w:val="center"/>
+          </w:tcPr>
+          <w:p>
+            <w:pPr>
+              <w:spacing w:after="60"/>
+            </w:pPr>
+            <w:r>
+              <w:t xml:space="preserve">☐</w:t>
+            </w:r>
+          </w:p>
+        </w:tc>
+        <w:tc>
+          <w:tcPr>
+            <w:tcW w:type="dxa" w:w="761"/>
+            <w:tcMar>
+              <w:top w:type="dxa" w:w="40"/>
+              <w:left w:type="dxa" w:w="60"/>
+              <w:bottom w:type="dxa" w:w="40"/>
+              <w:right w:type="dxa" w:w="60"/>
+            </w:tcMar>
+            <w:vAlign w:val="center"/>
+          </w:tcPr>
+          <w:p>
+            <w:pPr>
+              <w:spacing w:after="60"/>
+            </w:pPr>
+            <w:r>
+              <w:t xml:space="preserve">☐</w:t>
+            </w:r>
+          </w:p>
+        </w:tc>
+        <w:tc>
+          <w:tcPr>
+            <w:tcW w:type="dxa" w:w="761"/>
+            <w:tcMar>
+              <w:top w:type="dxa" w:w="40"/>
+              <w:left w:type="dxa" w:w="60"/>
+              <w:bottom w:type="dxa" w:w="40"/>
+              <w:right w:type="dxa" w:w="60"/>
+            </w:tcMar>
+            <w:vAlign w:val="center"/>
+          </w:tcPr>
+          <w:p>
+            <w:pPr>
+              <w:spacing w:after="60"/>
+            </w:pPr>
+            <w:r>
+              <w:t xml:space="preserve">☐</w:t>
+            </w:r>
+          </w:p>
+        </w:tc>
+        <w:tc>
+          <w:tcPr>
+            <w:tcW w:type="dxa" w:w="761"/>
+            <w:tcMar>
+              <w:top w:type="dxa" w:w="40"/>
+              <w:left w:type="dxa" w:w="60"/>
+              <w:bottom w:type="dxa" w:w="40"/>
+              <w:right w:type="dxa" w:w="60"/>
+            </w:tcMar>
+            <w:vAlign w:val="center"/>
+          </w:tcPr>
+          <w:p>
+            <w:pPr>
+              <w:spacing w:after="60"/>
+            </w:pPr>
+            <w:r>
+              <w:t xml:space="preserve">☐</w:t>
+            </w:r>
+          </w:p>
+        </w:tc>
+        <w:tc>
+          <w:tcPr>
+            <w:tcW w:type="dxa" w:w="761"/>
+            <w:tcMar>
+              <w:top w:type="dxa" w:w="40"/>
+              <w:left w:type="dxa" w:w="60"/>
+              <w:bottom w:type="dxa" w:w="40"/>
+              <w:right w:type="dxa" w:w="60"/>
+            </w:tcMar>
+            <w:vAlign w:val="center"/>
+          </w:tcPr>
+          <w:p>
+            <w:pPr>
+              <w:spacing w:after="60"/>
+            </w:pPr>
+            <w:r>
+              <w:t xml:space="preserve">☐</w:t>
+            </w:r>
+          </w:p>
+        </w:tc>
+        <w:tc>
+          <w:tcPr>
+            <w:tcW w:type="dxa" w:w="761"/>
+            <w:tcMar>
+              <w:top w:type="dxa" w:w="40"/>
+              <w:left w:type="dxa" w:w="60"/>
+              <w:bottom w:type="dxa" w:w="40"/>
+              <w:right w:type="dxa" w:w="60"/>
+            </w:tcMar>
+            <w:vAlign w:val="center"/>
+          </w:tcPr>
+          <w:p>
+            <w:pPr>
+              <w:spacing w:after="60"/>
+            </w:pPr>
+            <w:r>
+              <w:t xml:space="preserve">☐</w:t>
+            </w:r>
+          </w:p>
+        </w:tc>
+        <w:tc>
+          <w:tcPr>
+            <w:tcW w:type="dxa" w:w="761"/>
+            <w:tcMar>
+              <w:top w:type="dxa" w:w="40"/>
+              <w:left w:type="dxa" w:w="60"/>
+              <w:bottom w:type="dxa" w:w="40"/>
+              <w:right w:type="dxa" w:w="60"/>
+            </w:tcMar>
+            <w:vAlign w:val="center"/>
+          </w:tcPr>
+          <w:p>
+            <w:pPr>
+              <w:spacing w:after="60"/>
+            </w:pPr>
+            <w:r>
+              <w:t xml:space="preserve">☐</w:t>
+            </w:r>
+          </w:p>
+        </w:tc>
+        <w:tc>
+          <w:tcPr>
+            <w:tcW w:type="dxa" w:w="761"/>
+            <w:tcMar>
+              <w:top w:type="dxa" w:w="40"/>
+              <w:left w:type="dxa" w:w="60"/>
+              <w:bottom w:type="dxa" w:w="40"/>
+              <w:right w:type="dxa" w:w="60"/>
+            </w:tcMar>
+            <w:vAlign w:val="center"/>
+          </w:tcPr>
+          <w:p>
+            <w:pPr>
+              <w:spacing w:after="60"/>
+            </w:pPr>
+            <w:r>
+              <w:t xml:space="preserve">☐</w:t>
+            </w:r>
+          </w:p>
+        </w:tc>
+        <w:tc>
+          <w:tcPr>
+            <w:tcW w:type="dxa" w:w="761"/>
+            <w:tcMar>
+              <w:top w:type="dxa" w:w="40"/>
+              <w:left w:type="dxa" w:w="60"/>
+              <w:bottom w:type="dxa" w:w="40"/>
+              <w:right w:type="dxa" w:w="60"/>
+            </w:tcMar>
+            <w:vAlign w:val="center"/>
+          </w:tcPr>
+          <w:p>
+            <w:pPr>
+              <w:spacing w:after="60"/>
+            </w:pPr>
+            <w:r>
+              <w:t xml:space="preserve">☐</w:t>
+            </w:r>
+          </w:p>
+        </w:tc>
+        <w:tc>
+          <w:tcPr>
+            <w:tcW w:type="dxa" w:w="761"/>
+            <w:tcMar>
+              <w:top w:type="dxa" w:w="40"/>
+              <w:left w:type="dxa" w:w="60"/>
+              <w:bottom w:type="dxa" w:w="40"/>
+              <w:right w:type="dxa" w:w="60"/>
+            </w:tcMar>
+            <w:vAlign w:val="center"/>
+          </w:tcPr>
+          <w:p>
+            <w:pPr>
+              <w:spacing w:after="60"/>
+            </w:pPr>
+            <w:r>
+              <w:t xml:space="preserve">☐</w:t>
+            </w:r>
+          </w:p>
+        </w:tc>
+        <w:tc>
+          <w:tcPr>
+            <w:tcW w:type="dxa" w:w="761"/>
+            <w:tcMar>
+              <w:top w:type="dxa" w:w="40"/>
+              <w:left w:type="dxa" w:w="60"/>
+              <w:bottom w:type="dxa" w:w="40"/>
+              <w:right w:type="dxa" w:w="60"/>
+            </w:tcMar>
+            <w:vAlign w:val="center"/>
+          </w:tcPr>
+          <w:p>
+            <w:pPr>
+              <w:spacing w:after="60"/>
+            </w:pPr>
+            <w:r>
+              <w:t xml:space="preserve">☐</w:t>
+            </w:r>
+          </w:p>
+        </w:tc>
+        <w:tc>
+          <w:tcPr>
+            <w:tcW w:type="dxa" w:w="761"/>
+            <w:tcMar>
+              <w:top w:type="dxa" w:w="40"/>
+              <w:left w:type="dxa" w:w="60"/>
+              <w:bottom w:type="dxa" w:w="40"/>
+              <w:right w:type="dxa" w:w="60"/>
+            </w:tcMar>
+            <w:vAlign w:val="center"/>
+          </w:tcPr>
+          <w:p>
+            <w:pPr>
+              <w:spacing w:after="60"/>
+            </w:pPr>
+            <w:r>
+              <w:t xml:space="preserve">☐</w:t>
+            </w:r>
+          </w:p>
+        </w:tc>
+      </w:tr>
     </w:tbl>
+    <w:p>
+      <w:pPr>
+        <w:pBdr>
+          <w:bottom w:val="single" w:color="BBBBBB" w:sz="4"/>
+        </w:pBdr>
+        <w:spacing w:after="90"/>
+      </w:pPr>
+      <w:r>
+        <w:rPr>
+          <w:b/>
+          <w:bCs/>
+          <w:sz w:val="20"/>
+          <w:szCs w:val="20"/>
+        </w:rPr>
+        <w:t xml:space="preserve">If "Other" (tool 18) ticked for any animal, specify which tool(s):  </w:t>
+      </w:r>
+    </w:p>
     <w:p>
       <w:pPr>
         <w:spacing w:after="60"/>
@@ -10582,6 +11671,538 @@
           </w:p>
         </w:tc>
       </w:tr>
+      <w:tr>
+        <w:tc>
+          <w:tcPr>
+            <w:tcW w:type="dxa" w:w="2200"/>
+            <w:tcMar>
+              <w:top w:type="dxa" w:w="40"/>
+              <w:left w:type="dxa" w:w="60"/>
+              <w:bottom w:type="dxa" w:w="40"/>
+              <w:right w:type="dxa" w:w="60"/>
+            </w:tcMar>
+            <w:vAlign w:val="center"/>
+          </w:tcPr>
+          <w:p>
+            <w:pPr>
+              <w:spacing w:after="60"/>
+            </w:pPr>
+            <w:r>
+              <w:rPr>
+                <w:b/>
+                <w:bCs/>
+              </w:rPr>
+              <w:t xml:space="preserve">Cassowary</w:t>
+            </w:r>
+          </w:p>
+        </w:tc>
+        <w:tc>
+          <w:tcPr>
+            <w:tcW w:type="dxa" w:w="1099"/>
+            <w:tcMar>
+              <w:top w:type="dxa" w:w="40"/>
+              <w:left w:type="dxa" w:w="60"/>
+              <w:bottom w:type="dxa" w:w="40"/>
+              <w:right w:type="dxa" w:w="60"/>
+            </w:tcMar>
+            <w:vAlign w:val="center"/>
+          </w:tcPr>
+          <w:p>
+            <w:pPr>
+              <w:spacing w:after="60"/>
+            </w:pPr>
+            <w:r>
+              <w:t xml:space="preserve">☐</w:t>
+            </w:r>
+          </w:p>
+        </w:tc>
+        <w:tc>
+          <w:tcPr>
+            <w:tcW w:type="dxa" w:w="1099"/>
+            <w:tcMar>
+              <w:top w:type="dxa" w:w="40"/>
+              <w:left w:type="dxa" w:w="60"/>
+              <w:bottom w:type="dxa" w:w="40"/>
+              <w:right w:type="dxa" w:w="60"/>
+            </w:tcMar>
+            <w:vAlign w:val="center"/>
+          </w:tcPr>
+          <w:p>
+            <w:pPr>
+              <w:spacing w:after="60"/>
+            </w:pPr>
+            <w:r>
+              <w:t xml:space="preserve">☐</w:t>
+            </w:r>
+          </w:p>
+        </w:tc>
+        <w:tc>
+          <w:tcPr>
+            <w:tcW w:type="dxa" w:w="1099"/>
+            <w:tcMar>
+              <w:top w:type="dxa" w:w="40"/>
+              <w:left w:type="dxa" w:w="60"/>
+              <w:bottom w:type="dxa" w:w="40"/>
+              <w:right w:type="dxa" w:w="60"/>
+            </w:tcMar>
+            <w:vAlign w:val="center"/>
+          </w:tcPr>
+          <w:p>
+            <w:pPr>
+              <w:spacing w:after="60"/>
+            </w:pPr>
+            <w:r>
+              <w:t xml:space="preserve">☐</w:t>
+            </w:r>
+          </w:p>
+        </w:tc>
+        <w:tc>
+          <w:tcPr>
+            <w:tcW w:type="dxa" w:w="1099"/>
+            <w:tcMar>
+              <w:top w:type="dxa" w:w="40"/>
+              <w:left w:type="dxa" w:w="60"/>
+              <w:bottom w:type="dxa" w:w="40"/>
+              <w:right w:type="dxa" w:w="60"/>
+            </w:tcMar>
+            <w:vAlign w:val="center"/>
+          </w:tcPr>
+          <w:p>
+            <w:pPr>
+              <w:spacing w:after="60"/>
+            </w:pPr>
+            <w:r>
+              <w:t xml:space="preserve">☐</w:t>
+            </w:r>
+          </w:p>
+        </w:tc>
+        <w:tc>
+          <w:tcPr>
+            <w:tcW w:type="dxa" w:w="1099"/>
+            <w:tcMar>
+              <w:top w:type="dxa" w:w="40"/>
+              <w:left w:type="dxa" w:w="60"/>
+              <w:bottom w:type="dxa" w:w="40"/>
+              <w:right w:type="dxa" w:w="60"/>
+            </w:tcMar>
+            <w:vAlign w:val="center"/>
+          </w:tcPr>
+          <w:p>
+            <w:pPr>
+              <w:spacing w:after="60"/>
+            </w:pPr>
+            <w:r>
+              <w:t xml:space="preserve">☐</w:t>
+            </w:r>
+          </w:p>
+        </w:tc>
+        <w:tc>
+          <w:tcPr>
+            <w:tcW w:type="dxa" w:w="1099"/>
+            <w:tcMar>
+              <w:top w:type="dxa" w:w="40"/>
+              <w:left w:type="dxa" w:w="60"/>
+              <w:bottom w:type="dxa" w:w="40"/>
+              <w:right w:type="dxa" w:w="60"/>
+            </w:tcMar>
+            <w:vAlign w:val="center"/>
+          </w:tcPr>
+          <w:p>
+            <w:pPr>
+              <w:spacing w:after="60"/>
+            </w:pPr>
+            <w:r>
+              <w:t xml:space="preserve">☐</w:t>
+            </w:r>
+          </w:p>
+        </w:tc>
+        <w:tc>
+          <w:tcPr>
+            <w:tcW w:type="dxa" w:w="1099"/>
+            <w:tcMar>
+              <w:top w:type="dxa" w:w="40"/>
+              <w:left w:type="dxa" w:w="60"/>
+              <w:bottom w:type="dxa" w:w="40"/>
+              <w:right w:type="dxa" w:w="60"/>
+            </w:tcMar>
+            <w:vAlign w:val="center"/>
+          </w:tcPr>
+          <w:p>
+            <w:pPr>
+              <w:spacing w:after="60"/>
+            </w:pPr>
+            <w:r>
+              <w:t xml:space="preserve">☐</w:t>
+            </w:r>
+          </w:p>
+        </w:tc>
+        <w:tc>
+          <w:tcPr>
+            <w:tcW w:type="dxa" w:w="1099"/>
+            <w:tcMar>
+              <w:top w:type="dxa" w:w="40"/>
+              <w:left w:type="dxa" w:w="60"/>
+              <w:bottom w:type="dxa" w:w="40"/>
+              <w:right w:type="dxa" w:w="60"/>
+            </w:tcMar>
+            <w:vAlign w:val="center"/>
+          </w:tcPr>
+          <w:p>
+            <w:pPr>
+              <w:spacing w:after="60"/>
+            </w:pPr>
+            <w:r>
+              <w:t xml:space="preserve">☐</w:t>
+            </w:r>
+          </w:p>
+        </w:tc>
+        <w:tc>
+          <w:tcPr>
+            <w:tcW w:type="dxa" w:w="1099"/>
+            <w:tcMar>
+              <w:top w:type="dxa" w:w="40"/>
+              <w:left w:type="dxa" w:w="60"/>
+              <w:bottom w:type="dxa" w:w="40"/>
+              <w:right w:type="dxa" w:w="60"/>
+            </w:tcMar>
+            <w:vAlign w:val="center"/>
+          </w:tcPr>
+          <w:p>
+            <w:pPr>
+              <w:spacing w:after="60"/>
+            </w:pPr>
+            <w:r>
+              <w:t xml:space="preserve">☐</w:t>
+            </w:r>
+          </w:p>
+        </w:tc>
+        <w:tc>
+          <w:tcPr>
+            <w:tcW w:type="dxa" w:w="1099"/>
+            <w:tcMar>
+              <w:top w:type="dxa" w:w="40"/>
+              <w:left w:type="dxa" w:w="60"/>
+              <w:bottom w:type="dxa" w:w="40"/>
+              <w:right w:type="dxa" w:w="60"/>
+            </w:tcMar>
+            <w:vAlign w:val="center"/>
+          </w:tcPr>
+          <w:p>
+            <w:pPr>
+              <w:spacing w:after="60"/>
+            </w:pPr>
+            <w:r>
+              <w:t xml:space="preserve">☐</w:t>
+            </w:r>
+          </w:p>
+        </w:tc>
+        <w:tc>
+          <w:tcPr>
+            <w:tcW w:type="dxa" w:w="1099"/>
+            <w:tcMar>
+              <w:top w:type="dxa" w:w="40"/>
+              <w:left w:type="dxa" w:w="60"/>
+              <w:bottom w:type="dxa" w:w="40"/>
+              <w:right w:type="dxa" w:w="60"/>
+            </w:tcMar>
+            <w:vAlign w:val="center"/>
+          </w:tcPr>
+          <w:p>
+            <w:pPr>
+              <w:spacing w:after="60"/>
+            </w:pPr>
+            <w:r>
+              <w:t xml:space="preserve">☐</w:t>
+            </w:r>
+          </w:p>
+        </w:tc>
+        <w:tc>
+          <w:tcPr>
+            <w:tcW w:type="dxa" w:w="1099"/>
+            <w:tcMar>
+              <w:top w:type="dxa" w:w="40"/>
+              <w:left w:type="dxa" w:w="60"/>
+              <w:bottom w:type="dxa" w:w="40"/>
+              <w:right w:type="dxa" w:w="60"/>
+            </w:tcMar>
+            <w:vAlign w:val="center"/>
+          </w:tcPr>
+          <w:p>
+            <w:pPr>
+              <w:spacing w:after="60"/>
+            </w:pPr>
+            <w:r>
+              <w:t xml:space="preserve">☐</w:t>
+            </w:r>
+          </w:p>
+        </w:tc>
+      </w:tr>
+      <w:tr>
+        <w:tc>
+          <w:tcPr>
+            <w:tcW w:type="dxa" w:w="2200"/>
+            <w:tcMar>
+              <w:top w:type="dxa" w:w="40"/>
+              <w:left w:type="dxa" w:w="60"/>
+              <w:bottom w:type="dxa" w:w="40"/>
+              <w:right w:type="dxa" w:w="60"/>
+            </w:tcMar>
+            <w:vAlign w:val="center"/>
+          </w:tcPr>
+          <w:p>
+            <w:pPr>
+              <w:spacing w:after="60"/>
+            </w:pPr>
+            <w:r>
+              <w:rPr>
+                <w:b/>
+                <w:bCs/>
+              </w:rPr>
+              <w:t xml:space="preserve">Wild pig</w:t>
+            </w:r>
+          </w:p>
+        </w:tc>
+        <w:tc>
+          <w:tcPr>
+            <w:tcW w:type="dxa" w:w="1099"/>
+            <w:tcMar>
+              <w:top w:type="dxa" w:w="40"/>
+              <w:left w:type="dxa" w:w="60"/>
+              <w:bottom w:type="dxa" w:w="40"/>
+              <w:right w:type="dxa" w:w="60"/>
+            </w:tcMar>
+            <w:vAlign w:val="center"/>
+          </w:tcPr>
+          <w:p>
+            <w:pPr>
+              <w:spacing w:after="60"/>
+            </w:pPr>
+            <w:r>
+              <w:t xml:space="preserve">☐</w:t>
+            </w:r>
+          </w:p>
+        </w:tc>
+        <w:tc>
+          <w:tcPr>
+            <w:tcW w:type="dxa" w:w="1099"/>
+            <w:tcMar>
+              <w:top w:type="dxa" w:w="40"/>
+              <w:left w:type="dxa" w:w="60"/>
+              <w:bottom w:type="dxa" w:w="40"/>
+              <w:right w:type="dxa" w:w="60"/>
+            </w:tcMar>
+            <w:vAlign w:val="center"/>
+          </w:tcPr>
+          <w:p>
+            <w:pPr>
+              <w:spacing w:after="60"/>
+            </w:pPr>
+            <w:r>
+              <w:t xml:space="preserve">☐</w:t>
+            </w:r>
+          </w:p>
+        </w:tc>
+        <w:tc>
+          <w:tcPr>
+            <w:tcW w:type="dxa" w:w="1099"/>
+            <w:tcMar>
+              <w:top w:type="dxa" w:w="40"/>
+              <w:left w:type="dxa" w:w="60"/>
+              <w:bottom w:type="dxa" w:w="40"/>
+              <w:right w:type="dxa" w:w="60"/>
+            </w:tcMar>
+            <w:vAlign w:val="center"/>
+          </w:tcPr>
+          <w:p>
+            <w:pPr>
+              <w:spacing w:after="60"/>
+            </w:pPr>
+            <w:r>
+              <w:t xml:space="preserve">☐</w:t>
+            </w:r>
+          </w:p>
+        </w:tc>
+        <w:tc>
+          <w:tcPr>
+            <w:tcW w:type="dxa" w:w="1099"/>
+            <w:tcMar>
+              <w:top w:type="dxa" w:w="40"/>
+              <w:left w:type="dxa" w:w="60"/>
+              <w:bottom w:type="dxa" w:w="40"/>
+              <w:right w:type="dxa" w:w="60"/>
+            </w:tcMar>
+            <w:vAlign w:val="center"/>
+          </w:tcPr>
+          <w:p>
+            <w:pPr>
+              <w:spacing w:after="60"/>
+            </w:pPr>
+            <w:r>
+              <w:t xml:space="preserve">☐</w:t>
+            </w:r>
+          </w:p>
+        </w:tc>
+        <w:tc>
+          <w:tcPr>
+            <w:tcW w:type="dxa" w:w="1099"/>
+            <w:tcMar>
+              <w:top w:type="dxa" w:w="40"/>
+              <w:left w:type="dxa" w:w="60"/>
+              <w:bottom w:type="dxa" w:w="40"/>
+              <w:right w:type="dxa" w:w="60"/>
+            </w:tcMar>
+            <w:vAlign w:val="center"/>
+          </w:tcPr>
+          <w:p>
+            <w:pPr>
+              <w:spacing w:after="60"/>
+            </w:pPr>
+            <w:r>
+              <w:t xml:space="preserve">☐</w:t>
+            </w:r>
+          </w:p>
+        </w:tc>
+        <w:tc>
+          <w:tcPr>
+            <w:tcW w:type="dxa" w:w="1099"/>
+            <w:tcMar>
+              <w:top w:type="dxa" w:w="40"/>
+              <w:left w:type="dxa" w:w="60"/>
+              <w:bottom w:type="dxa" w:w="40"/>
+              <w:right w:type="dxa" w:w="60"/>
+            </w:tcMar>
+            <w:vAlign w:val="center"/>
+          </w:tcPr>
+          <w:p>
+            <w:pPr>
+              <w:spacing w:after="60"/>
+            </w:pPr>
+            <w:r>
+              <w:t xml:space="preserve">☐</w:t>
+            </w:r>
+          </w:p>
+        </w:tc>
+        <w:tc>
+          <w:tcPr>
+            <w:tcW w:type="dxa" w:w="1099"/>
+            <w:tcMar>
+              <w:top w:type="dxa" w:w="40"/>
+              <w:left w:type="dxa" w:w="60"/>
+              <w:bottom w:type="dxa" w:w="40"/>
+              <w:right w:type="dxa" w:w="60"/>
+            </w:tcMar>
+            <w:vAlign w:val="center"/>
+          </w:tcPr>
+          <w:p>
+            <w:pPr>
+              <w:spacing w:after="60"/>
+            </w:pPr>
+            <w:r>
+              <w:t xml:space="preserve">☐</w:t>
+            </w:r>
+          </w:p>
+        </w:tc>
+        <w:tc>
+          <w:tcPr>
+            <w:tcW w:type="dxa" w:w="1099"/>
+            <w:tcMar>
+              <w:top w:type="dxa" w:w="40"/>
+              <w:left w:type="dxa" w:w="60"/>
+              <w:bottom w:type="dxa" w:w="40"/>
+              <w:right w:type="dxa" w:w="60"/>
+            </w:tcMar>
+            <w:vAlign w:val="center"/>
+          </w:tcPr>
+          <w:p>
+            <w:pPr>
+              <w:spacing w:after="60"/>
+            </w:pPr>
+            <w:r>
+              <w:t xml:space="preserve">☐</w:t>
+            </w:r>
+          </w:p>
+        </w:tc>
+        <w:tc>
+          <w:tcPr>
+            <w:tcW w:type="dxa" w:w="1099"/>
+            <w:tcMar>
+              <w:top w:type="dxa" w:w="40"/>
+              <w:left w:type="dxa" w:w="60"/>
+              <w:bottom w:type="dxa" w:w="40"/>
+              <w:right w:type="dxa" w:w="60"/>
+            </w:tcMar>
+            <w:vAlign w:val="center"/>
+          </w:tcPr>
+          <w:p>
+            <w:pPr>
+              <w:spacing w:after="60"/>
+            </w:pPr>
+            <w:r>
+              <w:t xml:space="preserve">☐</w:t>
+            </w:r>
+          </w:p>
+        </w:tc>
+        <w:tc>
+          <w:tcPr>
+            <w:tcW w:type="dxa" w:w="1099"/>
+            <w:tcMar>
+              <w:top w:type="dxa" w:w="40"/>
+              <w:left w:type="dxa" w:w="60"/>
+              <w:bottom w:type="dxa" w:w="40"/>
+              <w:right w:type="dxa" w:w="60"/>
+            </w:tcMar>
+            <w:vAlign w:val="center"/>
+          </w:tcPr>
+          <w:p>
+            <w:pPr>
+              <w:spacing w:after="60"/>
+            </w:pPr>
+            <w:r>
+              <w:t xml:space="preserve">☐</w:t>
+            </w:r>
+          </w:p>
+        </w:tc>
+        <w:tc>
+          <w:tcPr>
+            <w:tcW w:type="dxa" w:w="1099"/>
+            <w:tcMar>
+              <w:top w:type="dxa" w:w="40"/>
+              <w:left w:type="dxa" w:w="60"/>
+              <w:bottom w:type="dxa" w:w="40"/>
+              <w:right w:type="dxa" w:w="60"/>
+            </w:tcMar>
+            <w:vAlign w:val="center"/>
+          </w:tcPr>
+          <w:p>
+            <w:pPr>
+              <w:spacing w:after="60"/>
+            </w:pPr>
+            <w:r>
+              <w:t xml:space="preserve">☐</w:t>
+            </w:r>
+          </w:p>
+        </w:tc>
+        <w:tc>
+          <w:tcPr>
+            <w:tcW w:type="dxa" w:w="1099"/>
+            <w:tcMar>
+              <w:top w:type="dxa" w:w="40"/>
+              <w:left w:type="dxa" w:w="60"/>
+              <w:bottom w:type="dxa" w:w="40"/>
+              <w:right w:type="dxa" w:w="60"/>
+            </w:tcMar>
+            <w:vAlign w:val="center"/>
+          </w:tcPr>
+          <w:p>
+            <w:pPr>
+              <w:spacing w:after="60"/>
+            </w:pPr>
+            <w:r>
+              <w:t xml:space="preserve">☐</w:t>
+            </w:r>
+          </w:p>
+        </w:tc>
+      </w:tr>
     </w:tbl>
     <w:p>
       <w:pPr>
@@ -12801,6 +14422,218 @@
           </w:p>
         </w:tc>
       </w:tr>
+      <w:tr>
+        <w:tc>
+          <w:tcPr>
+            <w:tcW w:type="dxa" w:w="2600"/>
+            <w:tcMar>
+              <w:top w:type="dxa" w:w="40"/>
+              <w:left w:type="dxa" w:w="60"/>
+              <w:bottom w:type="dxa" w:w="40"/>
+              <w:right w:type="dxa" w:w="60"/>
+            </w:tcMar>
+            <w:vAlign w:val="center"/>
+          </w:tcPr>
+          <w:p>
+            <w:pPr>
+              <w:spacing w:after="60"/>
+            </w:pPr>
+            <w:r>
+              <w:rPr>
+                <w:b/>
+                <w:bCs/>
+              </w:rPr>
+              <w:t xml:space="preserve">Cassowary</w:t>
+            </w:r>
+          </w:p>
+        </w:tc>
+        <w:tc>
+          <w:tcPr>
+            <w:tcW w:type="dxa" w:w="1500"/>
+            <w:tcMar>
+              <w:top w:type="dxa" w:w="40"/>
+              <w:left w:type="dxa" w:w="60"/>
+              <w:bottom w:type="dxa" w:w="40"/>
+              <w:right w:type="dxa" w:w="60"/>
+            </w:tcMar>
+            <w:vAlign w:val="center"/>
+          </w:tcPr>
+          <w:p>
+            <w:pPr>
+              <w:spacing w:after="60"/>
+            </w:pPr>
+            <w:r>
+              <w:t xml:space="preserve"/>
+            </w:r>
+          </w:p>
+        </w:tc>
+        <w:tc>
+          <w:tcPr>
+            <w:tcW w:type="dxa" w:w="1500"/>
+            <w:tcMar>
+              <w:top w:type="dxa" w:w="40"/>
+              <w:left w:type="dxa" w:w="60"/>
+              <w:bottom w:type="dxa" w:w="40"/>
+              <w:right w:type="dxa" w:w="60"/>
+            </w:tcMar>
+            <w:vAlign w:val="center"/>
+          </w:tcPr>
+          <w:p>
+            <w:pPr>
+              <w:spacing w:after="60"/>
+            </w:pPr>
+            <w:r>
+              <w:t xml:space="preserve"/>
+            </w:r>
+          </w:p>
+        </w:tc>
+        <w:tc>
+          <w:tcPr>
+            <w:tcW w:type="dxa" w:w="1500"/>
+            <w:tcMar>
+              <w:top w:type="dxa" w:w="40"/>
+              <w:left w:type="dxa" w:w="60"/>
+              <w:bottom w:type="dxa" w:w="40"/>
+              <w:right w:type="dxa" w:w="60"/>
+            </w:tcMar>
+            <w:vAlign w:val="center"/>
+          </w:tcPr>
+          <w:p>
+            <w:pPr>
+              <w:spacing w:after="60"/>
+            </w:pPr>
+            <w:r>
+              <w:t xml:space="preserve"/>
+            </w:r>
+          </w:p>
+        </w:tc>
+        <w:tc>
+          <w:tcPr>
+            <w:tcW w:type="dxa" w:w="1500"/>
+            <w:tcMar>
+              <w:top w:type="dxa" w:w="40"/>
+              <w:left w:type="dxa" w:w="60"/>
+              <w:bottom w:type="dxa" w:w="40"/>
+              <w:right w:type="dxa" w:w="60"/>
+            </w:tcMar>
+            <w:vAlign w:val="center"/>
+          </w:tcPr>
+          <w:p>
+            <w:pPr>
+              <w:spacing w:after="60"/>
+            </w:pPr>
+            <w:r>
+              <w:t xml:space="preserve"/>
+            </w:r>
+          </w:p>
+        </w:tc>
+      </w:tr>
+      <w:tr>
+        <w:tc>
+          <w:tcPr>
+            <w:tcW w:type="dxa" w:w="2600"/>
+            <w:tcMar>
+              <w:top w:type="dxa" w:w="40"/>
+              <w:left w:type="dxa" w:w="60"/>
+              <w:bottom w:type="dxa" w:w="40"/>
+              <w:right w:type="dxa" w:w="60"/>
+            </w:tcMar>
+            <w:vAlign w:val="center"/>
+          </w:tcPr>
+          <w:p>
+            <w:pPr>
+              <w:spacing w:after="60"/>
+            </w:pPr>
+            <w:r>
+              <w:rPr>
+                <w:b/>
+                <w:bCs/>
+              </w:rPr>
+              <w:t xml:space="preserve">Wild pig</w:t>
+            </w:r>
+          </w:p>
+        </w:tc>
+        <w:tc>
+          <w:tcPr>
+            <w:tcW w:type="dxa" w:w="1500"/>
+            <w:tcMar>
+              <w:top w:type="dxa" w:w="40"/>
+              <w:left w:type="dxa" w:w="60"/>
+              <w:bottom w:type="dxa" w:w="40"/>
+              <w:right w:type="dxa" w:w="60"/>
+            </w:tcMar>
+            <w:vAlign w:val="center"/>
+          </w:tcPr>
+          <w:p>
+            <w:pPr>
+              <w:spacing w:after="60"/>
+            </w:pPr>
+            <w:r>
+              <w:t xml:space="preserve"/>
+            </w:r>
+          </w:p>
+        </w:tc>
+        <w:tc>
+          <w:tcPr>
+            <w:tcW w:type="dxa" w:w="1500"/>
+            <w:tcMar>
+              <w:top w:type="dxa" w:w="40"/>
+              <w:left w:type="dxa" w:w="60"/>
+              <w:bottom w:type="dxa" w:w="40"/>
+              <w:right w:type="dxa" w:w="60"/>
+            </w:tcMar>
+            <w:vAlign w:val="center"/>
+          </w:tcPr>
+          <w:p>
+            <w:pPr>
+              <w:spacing w:after="60"/>
+            </w:pPr>
+            <w:r>
+              <w:t xml:space="preserve"/>
+            </w:r>
+          </w:p>
+        </w:tc>
+        <w:tc>
+          <w:tcPr>
+            <w:tcW w:type="dxa" w:w="1500"/>
+            <w:tcMar>
+              <w:top w:type="dxa" w:w="40"/>
+              <w:left w:type="dxa" w:w="60"/>
+              <w:bottom w:type="dxa" w:w="40"/>
+              <w:right w:type="dxa" w:w="60"/>
+            </w:tcMar>
+            <w:vAlign w:val="center"/>
+          </w:tcPr>
+          <w:p>
+            <w:pPr>
+              <w:spacing w:after="60"/>
+            </w:pPr>
+            <w:r>
+              <w:t xml:space="preserve"/>
+            </w:r>
+          </w:p>
+        </w:tc>
+        <w:tc>
+          <w:tcPr>
+            <w:tcW w:type="dxa" w:w="1500"/>
+            <w:tcMar>
+              <w:top w:type="dxa" w:w="40"/>
+              <w:left w:type="dxa" w:w="60"/>
+              <w:bottom w:type="dxa" w:w="40"/>
+              <w:right w:type="dxa" w:w="60"/>
+            </w:tcMar>
+            <w:vAlign w:val="center"/>
+          </w:tcPr>
+          <w:p>
+            <w:pPr>
+              <w:spacing w:after="60"/>
+            </w:pPr>
+            <w:r>
+              <w:t xml:space="preserve"/>
+            </w:r>
+          </w:p>
+        </w:tc>
+      </w:tr>
     </w:tbl>
     <w:p>
       <w:pPr>
@@ -14041,6 +15874,218 @@
                 <w:bCs/>
               </w:rPr>
               <w:t xml:space="preserve">Bushfowl</w:t>
+            </w:r>
+          </w:p>
+        </w:tc>
+        <w:tc>
+          <w:tcPr>
+            <w:tcW w:type="dxa" w:w="1600"/>
+            <w:tcMar>
+              <w:top w:type="dxa" w:w="40"/>
+              <w:left w:type="dxa" w:w="60"/>
+              <w:bottom w:type="dxa" w:w="40"/>
+              <w:right w:type="dxa" w:w="60"/>
+            </w:tcMar>
+            <w:vAlign w:val="center"/>
+          </w:tcPr>
+          <w:p>
+            <w:pPr>
+              <w:spacing w:after="60"/>
+            </w:pPr>
+            <w:r>
+              <w:t xml:space="preserve"/>
+            </w:r>
+          </w:p>
+        </w:tc>
+        <w:tc>
+          <w:tcPr>
+            <w:tcW w:type="dxa" w:w="1600"/>
+            <w:tcMar>
+              <w:top w:type="dxa" w:w="40"/>
+              <w:left w:type="dxa" w:w="60"/>
+              <w:bottom w:type="dxa" w:w="40"/>
+              <w:right w:type="dxa" w:w="60"/>
+            </w:tcMar>
+            <w:vAlign w:val="center"/>
+          </w:tcPr>
+          <w:p>
+            <w:pPr>
+              <w:spacing w:after="60"/>
+            </w:pPr>
+            <w:r>
+              <w:t xml:space="preserve"/>
+            </w:r>
+          </w:p>
+        </w:tc>
+        <w:tc>
+          <w:tcPr>
+            <w:tcW w:type="dxa" w:w="1600"/>
+            <w:tcMar>
+              <w:top w:type="dxa" w:w="40"/>
+              <w:left w:type="dxa" w:w="60"/>
+              <w:bottom w:type="dxa" w:w="40"/>
+              <w:right w:type="dxa" w:w="60"/>
+            </w:tcMar>
+            <w:vAlign w:val="center"/>
+          </w:tcPr>
+          <w:p>
+            <w:pPr>
+              <w:spacing w:after="60"/>
+            </w:pPr>
+            <w:r>
+              <w:t xml:space="preserve"/>
+            </w:r>
+          </w:p>
+        </w:tc>
+        <w:tc>
+          <w:tcPr>
+            <w:tcW w:type="dxa" w:w="7998"/>
+            <w:tcMar>
+              <w:top w:type="dxa" w:w="40"/>
+              <w:left w:type="dxa" w:w="60"/>
+              <w:bottom w:type="dxa" w:w="40"/>
+              <w:right w:type="dxa" w:w="60"/>
+            </w:tcMar>
+            <w:vAlign w:val="center"/>
+          </w:tcPr>
+          <w:p>
+            <w:pPr>
+              <w:spacing w:after="60"/>
+            </w:pPr>
+            <w:r>
+              <w:t xml:space="preserve"/>
+            </w:r>
+          </w:p>
+        </w:tc>
+      </w:tr>
+      <w:tr>
+        <w:tc>
+          <w:tcPr>
+            <w:tcW w:type="dxa" w:w="2600"/>
+            <w:tcMar>
+              <w:top w:type="dxa" w:w="40"/>
+              <w:left w:type="dxa" w:w="60"/>
+              <w:bottom w:type="dxa" w:w="40"/>
+              <w:right w:type="dxa" w:w="60"/>
+            </w:tcMar>
+            <w:vAlign w:val="center"/>
+          </w:tcPr>
+          <w:p>
+            <w:pPr>
+              <w:spacing w:after="60"/>
+            </w:pPr>
+            <w:r>
+              <w:rPr>
+                <w:b/>
+                <w:bCs/>
+              </w:rPr>
+              <w:t xml:space="preserve">Cassowary</w:t>
+            </w:r>
+          </w:p>
+        </w:tc>
+        <w:tc>
+          <w:tcPr>
+            <w:tcW w:type="dxa" w:w="1600"/>
+            <w:tcMar>
+              <w:top w:type="dxa" w:w="40"/>
+              <w:left w:type="dxa" w:w="60"/>
+              <w:bottom w:type="dxa" w:w="40"/>
+              <w:right w:type="dxa" w:w="60"/>
+            </w:tcMar>
+            <w:vAlign w:val="center"/>
+          </w:tcPr>
+          <w:p>
+            <w:pPr>
+              <w:spacing w:after="60"/>
+            </w:pPr>
+            <w:r>
+              <w:t xml:space="preserve"/>
+            </w:r>
+          </w:p>
+        </w:tc>
+        <w:tc>
+          <w:tcPr>
+            <w:tcW w:type="dxa" w:w="1600"/>
+            <w:tcMar>
+              <w:top w:type="dxa" w:w="40"/>
+              <w:left w:type="dxa" w:w="60"/>
+              <w:bottom w:type="dxa" w:w="40"/>
+              <w:right w:type="dxa" w:w="60"/>
+            </w:tcMar>
+            <w:vAlign w:val="center"/>
+          </w:tcPr>
+          <w:p>
+            <w:pPr>
+              <w:spacing w:after="60"/>
+            </w:pPr>
+            <w:r>
+              <w:t xml:space="preserve"/>
+            </w:r>
+          </w:p>
+        </w:tc>
+        <w:tc>
+          <w:tcPr>
+            <w:tcW w:type="dxa" w:w="1600"/>
+            <w:tcMar>
+              <w:top w:type="dxa" w:w="40"/>
+              <w:left w:type="dxa" w:w="60"/>
+              <w:bottom w:type="dxa" w:w="40"/>
+              <w:right w:type="dxa" w:w="60"/>
+            </w:tcMar>
+            <w:vAlign w:val="center"/>
+          </w:tcPr>
+          <w:p>
+            <w:pPr>
+              <w:spacing w:after="60"/>
+            </w:pPr>
+            <w:r>
+              <w:t xml:space="preserve"/>
+            </w:r>
+          </w:p>
+        </w:tc>
+        <w:tc>
+          <w:tcPr>
+            <w:tcW w:type="dxa" w:w="7998"/>
+            <w:tcMar>
+              <w:top w:type="dxa" w:w="40"/>
+              <w:left w:type="dxa" w:w="60"/>
+              <w:bottom w:type="dxa" w:w="40"/>
+              <w:right w:type="dxa" w:w="60"/>
+            </w:tcMar>
+            <w:vAlign w:val="center"/>
+          </w:tcPr>
+          <w:p>
+            <w:pPr>
+              <w:spacing w:after="60"/>
+            </w:pPr>
+            <w:r>
+              <w:t xml:space="preserve"/>
+            </w:r>
+          </w:p>
+        </w:tc>
+      </w:tr>
+      <w:tr>
+        <w:tc>
+          <w:tcPr>
+            <w:tcW w:type="dxa" w:w="2600"/>
+            <w:tcMar>
+              <w:top w:type="dxa" w:w="40"/>
+              <w:left w:type="dxa" w:w="60"/>
+              <w:bottom w:type="dxa" w:w="40"/>
+              <w:right w:type="dxa" w:w="60"/>
+            </w:tcMar>
+            <w:vAlign w:val="center"/>
+          </w:tcPr>
+          <w:p>
+            <w:pPr>
+              <w:spacing w:after="60"/>
+            </w:pPr>
+            <w:r>
+              <w:rPr>
+                <w:b/>
+                <w:bCs/>
+              </w:rPr>
+              <w:t xml:space="preserve">Wild pig</w:t>
             </w:r>
           </w:p>
         </w:tc>

</xml_diff>